<commit_message>
docs: align supplementary tables S1-S3 with manuscript terminology (participant-level wording, feature level, 50 random seeds, Target-cohort n header; remove pre-registration wording)
</commit_message>
<xml_diff>
--- a/docs/supplementary/Supplementary_Table_S1_cleaning_attrition.docx
+++ b/docs/supplementary/Supplementary_Table_S1_cleaning_attrition.docx
@@ -13,7 +13,7 @@
     </w:p>
     <w:p>
       <w:r>
-        <w:t>All analysis metrics use the digraph — an ordered pair of consecutive keystrokes — as the basic unit of computation. Three timing quantities are derived per digraph: hold is the key-press duration, latency is the interval from the previous key release to the current key press, and flight is the press-to-press interval. A session is one continuous typing run: visit files for MIT, monthly files for Tappy, visits for TyPD, and single continuous entries for OE. Cleaning did not reference participants’ diagnostic labels at any step and relied only on the quality of the typing data itself.</w:t>
+        <w:t>All analysis metrics use the digraph — an ordered pair of consecutive keystrokes — as the basic unit of computation. Three timing quantities are derived per digraph: hold is the key press duration, latency is the time from the release of the previous keystroke to the press of the current keystroke, and flight is the interval between two consecutive keystrokes. A session is one continuous typing run: visit files for MIT, monthly files for Tappy, visits for TyPD, and single continuous entries for OE. Data cleaning did not reference participants’ diagnostic labels at any step and relied solely on the quality of the typing data.</w:t>
       </w:r>
     </w:p>
     <w:p>
@@ -21,7 +21,7 @@
         <w:rPr>
           <w:b/>
         </w:rPr>
-        <w:t>Panel A. Cleaning rules (applied in this order; thresholds fixed in the analysis plan)</w:t>
+        <w:t>Panel A. Cleaning rules (applied in this order)</w:t>
       </w:r>
     </w:p>
     <w:tbl>
@@ -389,7 +389,7 @@
               <w:rPr>
                 <w:sz w:val="18"/>
               </w:rPr>
-              <w:t>Label rules: participants without diagnosis labels excluded; labelled participants whose records contain no parseable events never enter the pipeline; three Tappy participants reporting tremor without a PD diagnosis excluded from the primary analysis (re-inclusion under each label assignment reported as a sensitivity analysis).</w:t>
+              <w:t>Label rules: participants without diagnosis labels excluded; labeled participants whose records contain no parseable events never enter the pipeline; three Tappy participants reporting tremor without a PD diagnosis excluded from the primary analysis (re-inclusion under each label assignment reported as a sensitivity analysis).</w:t>
             </w:r>
           </w:p>
         </w:tc>
@@ -1102,7 +1102,7 @@
         <w:rPr>
           <w:sz w:val="18"/>
         </w:rPr>
-        <w:t>(2) At S7, 29 participants without labels and 3 tremor-only participants were removed from the 205 Tappy survivors; a further 10 labelled Tappy participants never entered the pipeline because their records contained no parseable events (they are not included in the counts above).</w:t>
+        <w:t>(2) At S7, 29 participants without labels and 3 tremor-only participants were removed from the 205 Tappy survivors; a further 10 labeled Tappy participants never entered the pipeline because their records contained no parseable events (they are not included in the counts above).</w:t>
       </w:r>
     </w:p>
     <w:p>

</xml_diff>